<commit_message>
搭建CMake + gRPC，跑通 drop_server 骨架；编写agent代码
</commit_message>
<xml_diff>
--- a/项目学习笔记.docx
+++ b/项目学习笔记.docx
@@ -756,6 +756,55 @@
             <w:pPr>
               <w:spacing w:line="440" w:lineRule="exact"/>
             </w:pPr>
+            <w:r>
+              <w:rPr>
+                <w:rFonts w:hint="eastAsia"/>
+              </w:rPr>
+              <w:t>Day1:</w:t>
+            </w:r>
+            <w:r>
+              <w:rPr>
+                <w:rFonts w:hint="eastAsia"/>
+              </w:rPr>
+              <w:t>了解并</w:t>
+            </w:r>
+            <w:r>
+              <w:rPr>
+                <w:rFonts w:hint="eastAsia"/>
+              </w:rPr>
+              <w:t>掌握</w:t>
+            </w:r>
+            <w:r>
+              <w:rPr>
+                <w:rFonts w:hint="eastAsia"/>
+              </w:rPr>
+              <w:t>protobuf</w:t>
+            </w:r>
+            <w:r>
+              <w:rPr>
+                <w:rFonts w:hint="eastAsia"/>
+              </w:rPr>
+              <w:t>语法（</w:t>
+            </w:r>
+            <w:hyperlink r:id="rId6" w:history="1">
+              <w:r>
+                <w:rPr>
+                  <w:rStyle w:val="a4"/>
+                </w:rPr>
+                <w:t>https://protobuf.dev/programming-guides/proto3/</w:t>
+              </w:r>
+            </w:hyperlink>
+            <w:r>
+              <w:rPr>
+                <w:rFonts w:hint="eastAsia"/>
+              </w:rPr>
+              <w:t>）</w:t>
+            </w:r>
+          </w:p>
+          <w:p>
+            <w:pPr>
+              <w:spacing w:line="440" w:lineRule="exact"/>
+            </w:pPr>
           </w:p>
           <w:p>
             <w:pPr>
@@ -867,20 +916,54 @@
           <w:p>
             <w:pPr>
               <w:spacing w:line="440" w:lineRule="exact"/>
-            </w:pPr>
-            <w:r>
-              <w:rPr>
+              <w:rPr>
+                <w:rFonts w:hint="eastAsia"/>
+              </w:rPr>
+            </w:pPr>
+            <w:r>
+              <w:rPr>
+                <w:rFonts w:hint="eastAsia"/>
+              </w:rPr>
+              <w:lastRenderedPageBreak/>
+              <w:t>未学习：</w:t>
+            </w:r>
+            <w:r>
+              <w:rPr>
+                <w:rFonts w:hint="eastAsia"/>
+              </w:rPr>
+              <w:t>protobuf</w:t>
+            </w:r>
+            <w:r>
+              <w:rPr>
+                <w:rFonts w:hint="eastAsia"/>
+              </w:rPr>
+              <w:t>文件概念及其作用</w:t>
+            </w:r>
+          </w:p>
+          <w:p>
+            <w:pPr>
+              <w:spacing w:line="440" w:lineRule="exact"/>
+              <w:rPr>
+                <w:b/>
+                <w:bCs/>
+              </w:rPr>
+            </w:pPr>
+            <w:r>
+              <w:rPr>
+                <w:b/>
+                <w:bCs/>
                 <w:noProof/>
-              </w:rPr>
-              <w:lastRenderedPageBreak/>
+                <w:sz w:val="28"/>
+                <w:szCs w:val="28"/>
+              </w:rPr>
               <w:drawing>
-                <wp:anchor distT="0" distB="0" distL="114300" distR="114300" simplePos="0" relativeHeight="251658240" behindDoc="0" locked="0" layoutInCell="1" allowOverlap="1" wp14:anchorId="504F4C35" wp14:editId="6AF4CB84">
+                <wp:anchor distT="0" distB="0" distL="114300" distR="114300" simplePos="0" relativeHeight="251658240" behindDoc="0" locked="0" layoutInCell="1" allowOverlap="1" wp14:anchorId="504F4C35" wp14:editId="08B83A9B">
                   <wp:simplePos x="0" y="0"/>
                   <wp:positionH relativeFrom="column">
-                    <wp:posOffset>4445</wp:posOffset>
+                    <wp:posOffset>1905</wp:posOffset>
                   </wp:positionH>
                   <wp:positionV relativeFrom="paragraph">
-                    <wp:posOffset>-2150745</wp:posOffset>
+                    <wp:posOffset>-2220595</wp:posOffset>
                   </wp:positionV>
                   <wp:extent cx="4838700" cy="2218055"/>
                   <wp:effectExtent l="0" t="0" r="0" b="0"/>
@@ -899,7 +982,7 @@
                           </pic:cNvPicPr>
                         </pic:nvPicPr>
                         <pic:blipFill>
-                          <a:blip r:embed="rId6" cstate="print">
+                          <a:blip r:embed="rId7" cstate="print">
                             <a:extLst>
                               <a:ext uri="{28A0092B-C50C-407E-A947-70E740481C1C}">
                                 <a14:useLocalDpi xmlns:a14="http://schemas.microsoft.com/office/drawing/2010/main" val="0"/>
@@ -936,6 +1019,44 @@
                 </wp:anchor>
               </w:drawing>
             </w:r>
+            <w:r>
+              <w:rPr>
+                <w:rFonts w:hint="eastAsia"/>
+                <w:b/>
+                <w:bCs/>
+                <w:sz w:val="28"/>
+                <w:szCs w:val="28"/>
+              </w:rPr>
+              <w:t>6.15</w:t>
+            </w:r>
+            <w:r>
+              <w:rPr>
+                <w:rFonts w:hint="eastAsia"/>
+                <w:b/>
+                <w:bCs/>
+                <w:sz w:val="28"/>
+                <w:szCs w:val="28"/>
+              </w:rPr>
+              <w:t>：</w:t>
+            </w:r>
+            <w:r>
+              <w:rPr>
+                <w:rFonts w:hint="eastAsia"/>
+              </w:rPr>
+              <w:t>依据</w:t>
+            </w:r>
+            <w:r>
+              <w:rPr>
+                <w:rFonts w:hint="eastAsia"/>
+              </w:rPr>
+              <w:t>md</w:t>
+            </w:r>
+            <w:r>
+              <w:rPr>
+                <w:rFonts w:hint="eastAsia"/>
+              </w:rPr>
+              <w:t>文件</w:t>
+            </w:r>
           </w:p>
         </w:tc>
       </w:tr>
@@ -1153,253 +1274,37 @@
           </w:tcPr>
           <w:p>
             <w:pPr>
-              <w:numPr>
-                <w:ilvl w:val="0"/>
-                <w:numId w:val="2"/>
-              </w:numPr>
-              <w:spacing w:line="440" w:lineRule="exact"/>
-              <w:rPr>
-                <w:sz w:val="21"/>
-                <w:szCs w:val="21"/>
-              </w:rPr>
-            </w:pPr>
-            <w:r>
-              <w:rPr>
-                <w:sz w:val="21"/>
-                <w:szCs w:val="21"/>
-              </w:rPr>
-              <w:t>任何一行真实代码（指南明确说</w:t>
-            </w:r>
-            <w:r>
-              <w:rPr>
-                <w:sz w:val="21"/>
-                <w:szCs w:val="21"/>
-              </w:rPr>
-              <w:t>"</w:t>
-            </w:r>
-            <w:r>
-              <w:rPr>
-                <w:sz w:val="21"/>
-                <w:szCs w:val="21"/>
-              </w:rPr>
-              <w:t>不直接给代码</w:t>
-            </w:r>
-            <w:r>
-              <w:rPr>
-                <w:sz w:val="21"/>
-                <w:szCs w:val="21"/>
-              </w:rPr>
-              <w:t>"</w:t>
-            </w:r>
-            <w:r>
-              <w:rPr>
-                <w:sz w:val="21"/>
-                <w:szCs w:val="21"/>
-              </w:rPr>
-              <w:t>）</w:t>
-            </w:r>
-          </w:p>
-          <w:p>
-            <w:pPr>
-              <w:numPr>
-                <w:ilvl w:val="0"/>
-                <w:numId w:val="2"/>
-              </w:numPr>
-              <w:spacing w:line="440" w:lineRule="exact"/>
-              <w:rPr>
-                <w:sz w:val="21"/>
-                <w:szCs w:val="21"/>
-              </w:rPr>
-            </w:pPr>
-            <w:r>
-              <w:rPr>
-                <w:sz w:val="21"/>
-                <w:szCs w:val="21"/>
-              </w:rPr>
-              <w:t xml:space="preserve">C++ Agent </w:t>
-            </w:r>
-            <w:r>
-              <w:rPr>
-                <w:sz w:val="21"/>
-                <w:szCs w:val="21"/>
-              </w:rPr>
-              <w:t>的具体实现（</w:t>
-            </w:r>
-            <w:r>
-              <w:rPr>
-                <w:sz w:val="21"/>
-                <w:szCs w:val="21"/>
-              </w:rPr>
-              <w:t>fork/exec</w:t>
-            </w:r>
-            <w:r>
-              <w:rPr>
-                <w:sz w:val="21"/>
-                <w:szCs w:val="21"/>
-              </w:rPr>
-              <w:t>、线程模型、</w:t>
-            </w:r>
-            <w:r>
-              <w:rPr>
-                <w:sz w:val="21"/>
-                <w:szCs w:val="21"/>
-              </w:rPr>
-              <w:t>COS</w:t>
-            </w:r>
-            <w:r>
-              <w:rPr>
-                <w:sz w:val="21"/>
-                <w:szCs w:val="21"/>
-              </w:rPr>
-              <w:t>上传）</w:t>
-            </w:r>
-          </w:p>
-          <w:p>
-            <w:pPr>
-              <w:numPr>
-                <w:ilvl w:val="0"/>
-                <w:numId w:val="2"/>
-              </w:numPr>
-              <w:spacing w:line="440" w:lineRule="exact"/>
-              <w:rPr>
-                <w:sz w:val="21"/>
-                <w:szCs w:val="21"/>
-              </w:rPr>
-            </w:pPr>
-            <w:r>
-              <w:rPr>
-                <w:sz w:val="21"/>
-                <w:szCs w:val="21"/>
-              </w:rPr>
-              <w:t xml:space="preserve">Analyzer </w:t>
-            </w:r>
-            <w:r>
-              <w:rPr>
-                <w:sz w:val="21"/>
-                <w:szCs w:val="21"/>
-              </w:rPr>
-              <w:t>的</w:t>
-            </w:r>
-            <w:r>
-              <w:rPr>
-                <w:sz w:val="21"/>
-                <w:szCs w:val="21"/>
-              </w:rPr>
-              <w:t xml:space="preserve"> Python </w:t>
-            </w:r>
-            <w:r>
-              <w:rPr>
-                <w:sz w:val="21"/>
-                <w:szCs w:val="21"/>
-              </w:rPr>
-              <w:t>脚本（只说了用</w:t>
-            </w:r>
-            <w:r>
-              <w:rPr>
-                <w:sz w:val="21"/>
-                <w:szCs w:val="21"/>
-              </w:rPr>
-              <w:t xml:space="preserve"> flamegraph.pl</w:t>
-            </w:r>
-            <w:r>
-              <w:rPr>
-                <w:sz w:val="21"/>
-                <w:szCs w:val="21"/>
-              </w:rPr>
-              <w:t>）</w:t>
-            </w:r>
-          </w:p>
-          <w:p>
-            <w:pPr>
-              <w:numPr>
-                <w:ilvl w:val="0"/>
-                <w:numId w:val="2"/>
-              </w:numPr>
-              <w:spacing w:line="440" w:lineRule="exact"/>
-              <w:rPr>
-                <w:sz w:val="21"/>
-                <w:szCs w:val="21"/>
-              </w:rPr>
-            </w:pPr>
-            <w:r>
-              <w:rPr>
-                <w:sz w:val="21"/>
-                <w:szCs w:val="21"/>
-              </w:rPr>
-              <w:t xml:space="preserve">Web UI </w:t>
-            </w:r>
-            <w:r>
-              <w:rPr>
-                <w:sz w:val="21"/>
-                <w:szCs w:val="21"/>
-              </w:rPr>
-              <w:t>的组件代码</w:t>
-            </w:r>
-          </w:p>
-          <w:p>
-            <w:pPr>
-              <w:numPr>
-                <w:ilvl w:val="0"/>
-                <w:numId w:val="2"/>
-              </w:numPr>
-              <w:spacing w:line="440" w:lineRule="exact"/>
-              <w:rPr>
-                <w:sz w:val="21"/>
-                <w:szCs w:val="21"/>
-              </w:rPr>
-            </w:pPr>
-            <w:r>
-              <w:rPr>
-                <w:sz w:val="21"/>
-                <w:szCs w:val="21"/>
-              </w:rPr>
-              <w:t>单元测试怎么写</w:t>
-            </w:r>
-          </w:p>
-          <w:p>
-            <w:pPr>
-              <w:numPr>
-                <w:ilvl w:val="0"/>
-                <w:numId w:val="2"/>
-              </w:numPr>
-              <w:spacing w:line="440" w:lineRule="exact"/>
-              <w:rPr>
-                <w:sz w:val="21"/>
-                <w:szCs w:val="21"/>
-              </w:rPr>
-            </w:pPr>
-            <w:proofErr w:type="spellStart"/>
-            <w:r>
-              <w:rPr>
-                <w:sz w:val="21"/>
-                <w:szCs w:val="21"/>
-              </w:rPr>
-              <w:t>eBPF</w:t>
-            </w:r>
-            <w:proofErr w:type="spellEnd"/>
-            <w:r>
-              <w:rPr>
-                <w:sz w:val="21"/>
-                <w:szCs w:val="21"/>
-              </w:rPr>
-              <w:t xml:space="preserve"> </w:t>
-            </w:r>
-            <w:r>
-              <w:rPr>
-                <w:sz w:val="21"/>
-                <w:szCs w:val="21"/>
-              </w:rPr>
-              <w:t>采集器的实现</w:t>
-            </w:r>
-          </w:p>
-          <w:p>
-            <w:pPr>
-              <w:spacing w:line="440" w:lineRule="exact"/>
-              <w:rPr>
-                <w:sz w:val="21"/>
-                <w:szCs w:val="21"/>
-              </w:rPr>
-            </w:pPr>
+              <w:spacing w:line="440" w:lineRule="exact"/>
+              <w:rPr>
+                <w:rFonts w:hint="eastAsia"/>
+                <w:sz w:val="21"/>
+                <w:szCs w:val="21"/>
+              </w:rPr>
+            </w:pPr>
+            <w:r>
+              <w:rPr>
+                <w:rFonts w:hint="eastAsia"/>
+                <w:sz w:val="21"/>
+                <w:szCs w:val="21"/>
+              </w:rPr>
+              <w:t>观察到项目有五个</w:t>
+            </w:r>
+            <w:r>
+              <w:rPr>
+                <w:rFonts w:hint="eastAsia"/>
+                <w:sz w:val="21"/>
+                <w:szCs w:val="21"/>
+              </w:rPr>
+              <w:t>proto</w:t>
+            </w:r>
+            <w:r>
+              <w:rPr>
+                <w:rFonts w:hint="eastAsia"/>
+                <w:sz w:val="21"/>
+                <w:szCs w:val="21"/>
+              </w:rPr>
+              <w:t>文件。对该类型文件不了解</w:t>
+            </w:r>
           </w:p>
         </w:tc>
       </w:tr>
@@ -1456,7 +1361,121 @@
           <w:p>
             <w:pPr>
               <w:spacing w:line="440" w:lineRule="exact"/>
-            </w:pPr>
+              <w:rPr>
+                <w:rFonts w:hint="eastAsia"/>
+              </w:rPr>
+            </w:pPr>
+            <w:r>
+              <w:rPr>
+                <w:rFonts w:hint="eastAsia"/>
+              </w:rPr>
+              <w:t>根据</w:t>
+            </w:r>
+            <w:r>
+              <w:rPr>
+                <w:rFonts w:hint="eastAsia"/>
+              </w:rPr>
+              <w:t>已</w:t>
+            </w:r>
+            <w:r>
+              <w:rPr>
+                <w:rFonts w:hint="eastAsia"/>
+              </w:rPr>
+              <w:t>学习</w:t>
+            </w:r>
+            <w:r>
+              <w:rPr>
+                <w:rFonts w:hint="eastAsia"/>
+              </w:rPr>
+              <w:t>的</w:t>
+            </w:r>
+            <w:r>
+              <w:rPr>
+                <w:rFonts w:hint="eastAsia"/>
+              </w:rPr>
+              <w:t>protobuf</w:t>
+            </w:r>
+            <w:r>
+              <w:rPr>
+                <w:rFonts w:hint="eastAsia"/>
+              </w:rPr>
+              <w:t>语法，可以观察到文件包含</w:t>
+            </w:r>
+            <w:r>
+              <w:rPr>
+                <w:rFonts w:hint="eastAsia"/>
+              </w:rPr>
+              <w:t>message</w:t>
+            </w:r>
+            <w:r>
+              <w:rPr>
+                <w:rFonts w:hint="eastAsia"/>
+              </w:rPr>
+              <w:t>，</w:t>
+            </w:r>
+            <w:r>
+              <w:rPr>
+                <w:rFonts w:hint="eastAsia"/>
+              </w:rPr>
+              <w:t>service</w:t>
+            </w:r>
+            <w:r>
+              <w:rPr>
+                <w:rFonts w:hint="eastAsia"/>
+              </w:rPr>
+              <w:t>等特殊变量。</w:t>
+            </w:r>
+            <w:r>
+              <w:t>P</w:t>
+            </w:r>
+            <w:r>
+              <w:rPr>
+                <w:rFonts w:hint="eastAsia"/>
+              </w:rPr>
+              <w:t>roto</w:t>
+            </w:r>
+            <w:r>
+              <w:rPr>
+                <w:rFonts w:hint="eastAsia"/>
+              </w:rPr>
+              <w:t>文件中</w:t>
+            </w:r>
+            <w:r>
+              <w:rPr>
+                <w:rFonts w:hint="eastAsia"/>
+              </w:rPr>
+              <w:t>message</w:t>
+            </w:r>
+            <w:r>
+              <w:rPr>
+                <w:rFonts w:hint="eastAsia"/>
+              </w:rPr>
+              <w:t>类似</w:t>
+            </w:r>
+            <w:r>
+              <w:rPr>
+                <w:rFonts w:hint="eastAsia"/>
+              </w:rPr>
+              <w:t>C++</w:t>
+            </w:r>
+            <w:r>
+              <w:rPr>
+                <w:rFonts w:hint="eastAsia"/>
+              </w:rPr>
+              <w:t>的结构体，对数据定义一系列不同类型的变量。推测</w:t>
+            </w:r>
+            <w:r>
+              <w:rPr>
+                <w:rFonts w:hint="eastAsia"/>
+              </w:rPr>
+              <w:t>proto</w:t>
+            </w:r>
+            <w:r>
+              <w:rPr>
+                <w:rFonts w:hint="eastAsia"/>
+              </w:rPr>
+              <w:t>文件对某些数据进行序列号，并且有传输数据的作用。</w:t>
+            </w:r>
           </w:p>
         </w:tc>
       </w:tr>
@@ -1513,7 +1532,82 @@
           <w:p>
             <w:pPr>
               <w:spacing w:line="440" w:lineRule="exact"/>
-            </w:pPr>
+              <w:rPr>
+                <w:rFonts w:hint="eastAsia"/>
+              </w:rPr>
+            </w:pPr>
+            <w:r>
+              <w:rPr>
+                <w:rFonts w:hint="eastAsia"/>
+              </w:rPr>
+              <w:t>询问</w:t>
+            </w:r>
+            <w:r>
+              <w:rPr>
+                <w:rFonts w:hint="eastAsia"/>
+              </w:rPr>
+              <w:t>ai protobuf</w:t>
+            </w:r>
+            <w:r>
+              <w:rPr>
+                <w:rFonts w:hint="eastAsia"/>
+              </w:rPr>
+              <w:t>文件在项目中的作用。自行搜索</w:t>
+            </w:r>
+            <w:r>
+              <w:rPr>
+                <w:rFonts w:hint="eastAsia"/>
+              </w:rPr>
+              <w:t>protobuf</w:t>
+            </w:r>
+            <w:r>
+              <w:rPr>
+                <w:rFonts w:hint="eastAsia"/>
+              </w:rPr>
+              <w:t>文件相关知识，并了解它会在哪些场景下被使用。最后理解到，</w:t>
+            </w:r>
+            <w:r>
+              <w:rPr>
+                <w:rFonts w:hint="eastAsia"/>
+              </w:rPr>
+              <w:t>proto</w:t>
+            </w:r>
+            <w:r>
+              <w:rPr>
+                <w:rFonts w:hint="eastAsia"/>
+              </w:rPr>
+              <w:t>是一种数据描述文件</w:t>
+            </w:r>
+            <w:r>
+              <w:rPr>
+                <w:rFonts w:hint="eastAsia"/>
+              </w:rPr>
+              <w:t>。因为它传输时是二进制格式，所以</w:t>
+            </w:r>
+            <w:r>
+              <w:rPr>
+                <w:rFonts w:hint="eastAsia"/>
+              </w:rPr>
+              <w:t>它能够</w:t>
+            </w:r>
+            <w:r>
+              <w:rPr>
+                <w:rFonts w:hint="eastAsia"/>
+              </w:rPr>
+              <w:t>高效地序列化和反序列化数据。同时它还有跨语言通信与版本兼容性好的特点。所以</w:t>
+            </w:r>
+            <w:r>
+              <w:rPr>
+                <w:rFonts w:hint="eastAsia"/>
+              </w:rPr>
+              <w:t>proto</w:t>
+            </w:r>
+            <w:r>
+              <w:rPr>
+                <w:rFonts w:hint="eastAsia"/>
+              </w:rPr>
+              <w:t>适用于客户端与服务器之间高速传递信息，如游戏服务器储存读取玩家数据等。</w:t>
+            </w:r>
           </w:p>
         </w:tc>
       </w:tr>
@@ -1626,18 +1720,26 @@
               </w:rPr>
               <w:t>/</w:t>
             </w:r>
-            <w:proofErr w:type="spellStart"/>
-            <w:r>
-              <w:rPr>
-                <w:color w:val="0070C0"/>
-                <w:sz w:val="21"/>
-                <w:szCs w:val="21"/>
-              </w:rPr>
-              <w:t>Deepseek</w:t>
-            </w:r>
-            <w:proofErr w:type="spellEnd"/>
-            <w:r>
-              <w:rPr>
+            <w:r>
+              <w:rPr>
+                <w:color w:val="0070C0"/>
+                <w:sz w:val="21"/>
+                <w:szCs w:val="21"/>
+              </w:rPr>
+              <w:t>Deepseek/</w:t>
+            </w:r>
+            <w:r>
+              <w:rPr>
+                <w:rFonts w:hint="eastAsia"/>
+                <w:color w:val="0070C0"/>
+                <w:sz w:val="21"/>
+                <w:szCs w:val="21"/>
+              </w:rPr>
+              <w:t>豆包</w:t>
+            </w:r>
+            <w:r>
+              <w:rPr>
+                <w:rFonts w:hint="eastAsia"/>
                 <w:color w:val="0070C0"/>
                 <w:sz w:val="21"/>
                 <w:szCs w:val="21"/>
@@ -1651,11 +1753,10 @@
                 <w:sz w:val="21"/>
                 <w:szCs w:val="21"/>
               </w:rPr>
-              <w:t>豆包</w:t>
-            </w:r>
-            <w:r>
-              <w:rPr>
-                <w:rFonts w:hint="eastAsia"/>
+              <w:t>元宝</w:t>
+            </w:r>
+            <w:r>
+              <w:rPr>
                 <w:color w:val="0070C0"/>
                 <w:sz w:val="21"/>
                 <w:szCs w:val="21"/>
@@ -1669,27 +1770,8 @@
                 <w:sz w:val="21"/>
                 <w:szCs w:val="21"/>
               </w:rPr>
-              <w:t>元宝</w:t>
-            </w:r>
-            <w:r>
-              <w:rPr>
-                <w:color w:val="0070C0"/>
-                <w:sz w:val="21"/>
-                <w:szCs w:val="21"/>
-              </w:rPr>
-              <w:t>/</w:t>
-            </w:r>
-            <w:proofErr w:type="spellStart"/>
-            <w:r>
-              <w:rPr>
-                <w:rFonts w:hint="eastAsia"/>
-                <w:color w:val="0070C0"/>
-                <w:sz w:val="21"/>
-                <w:szCs w:val="21"/>
-              </w:rPr>
               <w:t>kimi</w:t>
             </w:r>
-            <w:proofErr w:type="spellEnd"/>
             <w:r>
               <w:rPr>
                 <w:color w:val="0070C0"/>
@@ -1756,6 +1838,475 @@
             <w:pPr>
               <w:spacing w:line="440" w:lineRule="exact"/>
             </w:pPr>
+            <w:r>
+              <w:t>C</w:t>
+            </w:r>
+            <w:r>
+              <w:rPr>
+                <w:rFonts w:hint="eastAsia"/>
+              </w:rPr>
+              <w:t>laude:</w:t>
+            </w:r>
+          </w:p>
+          <w:p>
+            <w:pPr>
+              <w:spacing w:line="440" w:lineRule="exact"/>
+            </w:pPr>
+            <w:r>
+              <w:rPr>
+                <w:rFonts w:hint="eastAsia"/>
+              </w:rPr>
+              <w:t>Q:</w:t>
+            </w:r>
+            <w:r>
+              <w:rPr>
+                <w:rFonts w:ascii="Segoe UI" w:hAnsi="Segoe UI" w:cs="Segoe UI"/>
+                <w:color w:val="0A0A0A"/>
+                <w:sz w:val="21"/>
+                <w:szCs w:val="21"/>
+              </w:rPr>
+              <w:t xml:space="preserve"> </w:t>
+            </w:r>
+            <w:r>
+              <w:t>目前我已经创建了所有代码空文件。今天我我需要完成</w:t>
+            </w:r>
+            <w:r>
+              <w:t>day1</w:t>
+            </w:r>
+            <w:r>
+              <w:t>的任务。请你告诉我</w:t>
+            </w:r>
+            <w:r>
+              <w:t>day1</w:t>
+            </w:r>
+            <w:r>
+              <w:t>的任务所创建的代码文件有何作用？以及我需要补充什么知识</w:t>
+            </w:r>
+          </w:p>
+          <w:p>
+            <w:pPr>
+              <w:spacing w:line="440" w:lineRule="exact"/>
+              <w:rPr>
+                <w:rFonts w:hint="eastAsia"/>
+              </w:rPr>
+            </w:pPr>
+          </w:p>
+          <w:p>
+            <w:pPr>
+              <w:spacing w:line="440" w:lineRule="exact"/>
+              <w:rPr>
+                <w:rFonts w:ascii="Segoe UI" w:hAnsi="Segoe UI" w:cs="Segoe UI"/>
+                <w:b/>
+                <w:bCs/>
+                <w:color w:val="6E6C68"/>
+                <w:kern w:val="0"/>
+                <w:sz w:val="26"/>
+                <w:szCs w:val="26"/>
+              </w:rPr>
+            </w:pPr>
+            <w:r>
+              <w:rPr>
+                <w:rFonts w:hint="eastAsia"/>
+              </w:rPr>
+              <w:lastRenderedPageBreak/>
+              <w:t>A(</w:t>
+            </w:r>
+            <w:r>
+              <w:rPr>
+                <w:rFonts w:hint="eastAsia"/>
+              </w:rPr>
+              <w:t>核心回答</w:t>
+            </w:r>
+            <w:r>
+              <w:rPr>
+                <w:rFonts w:hint="eastAsia"/>
+              </w:rPr>
+              <w:t>):</w:t>
+            </w:r>
+            <w:r>
+              <w:rPr>
+                <w:rFonts w:ascii="Segoe UI" w:hAnsi="Segoe UI" w:cs="Segoe UI"/>
+                <w:b/>
+                <w:bCs/>
+                <w:color w:val="6E6C68"/>
+                <w:kern w:val="0"/>
+                <w:sz w:val="26"/>
+                <w:szCs w:val="26"/>
+              </w:rPr>
+              <w:t xml:space="preserve"> </w:t>
+            </w:r>
+          </w:p>
+          <w:p>
+            <w:pPr>
+              <w:spacing w:line="440" w:lineRule="exact"/>
+            </w:pPr>
+            <w:r>
+              <w:t>三、你需要补充的知识</w:t>
+            </w:r>
+          </w:p>
+          <w:p>
+            <w:pPr>
+              <w:spacing w:line="440" w:lineRule="exact"/>
+            </w:pPr>
+            <w:r>
+              <w:t>必须今天掌握的</w:t>
+            </w:r>
+          </w:p>
+          <w:p>
+            <w:pPr>
+              <w:spacing w:line="440" w:lineRule="exact"/>
+            </w:pPr>
+            <w:r>
+              <w:t xml:space="preserve">1. Protobuf </w:t>
+            </w:r>
+            <w:r>
+              <w:t>语法（约</w:t>
+            </w:r>
+            <w:r>
+              <w:t>1</w:t>
+            </w:r>
+            <w:r>
+              <w:t>小时）</w:t>
+            </w:r>
+          </w:p>
+          <w:p>
+            <w:pPr>
+              <w:spacing w:line="440" w:lineRule="exact"/>
+              <w:rPr>
+                <w:rFonts w:hint="eastAsia"/>
+              </w:rPr>
+            </w:pPr>
+            <w:r>
+              <w:t>只需要看懂并能写这几个关键字：</w:t>
+            </w:r>
+          </w:p>
+          <w:p>
+            <w:pPr>
+              <w:spacing w:line="440" w:lineRule="exact"/>
+            </w:pPr>
+            <w:r>
+              <w:t xml:space="preserve">syntax = "proto3"; // </w:t>
+            </w:r>
+            <w:r>
+              <w:t>声明版本</w:t>
+            </w:r>
+          </w:p>
+          <w:p>
+            <w:pPr>
+              <w:spacing w:line="440" w:lineRule="exact"/>
+            </w:pPr>
+            <w:r>
+              <w:t xml:space="preserve">package drop; // </w:t>
+            </w:r>
+            <w:r>
+              <w:t>包名，避免命名冲突</w:t>
+            </w:r>
+          </w:p>
+          <w:p>
+            <w:pPr>
+              <w:spacing w:line="440" w:lineRule="exact"/>
+            </w:pPr>
+            <w:r>
+              <w:t xml:space="preserve">import "common.proto"; // </w:t>
+            </w:r>
+            <w:r>
+              <w:t>引入其他文件的定义</w:t>
+            </w:r>
+          </w:p>
+          <w:p>
+            <w:pPr>
+              <w:spacing w:line="440" w:lineRule="exact"/>
+            </w:pPr>
+            <w:r>
+              <w:t xml:space="preserve">message PidStats { // </w:t>
+            </w:r>
+            <w:r>
+              <w:t>定义数据结构（类似</w:t>
+            </w:r>
+            <w:r>
+              <w:t xml:space="preserve"> struct</w:t>
+            </w:r>
+            <w:r>
+              <w:t>）</w:t>
+            </w:r>
+          </w:p>
+          <w:p>
+            <w:pPr>
+              <w:spacing w:line="440" w:lineRule="exact"/>
+            </w:pPr>
+            <w:r>
+              <w:t xml:space="preserve">float cpu_percent = 1; // </w:t>
+            </w:r>
+            <w:r>
+              <w:t>字段类型</w:t>
+            </w:r>
+            <w:r>
+              <w:t xml:space="preserve"> </w:t>
+            </w:r>
+            <w:r>
+              <w:t>字段名</w:t>
+            </w:r>
+            <w:r>
+              <w:t xml:space="preserve"> = </w:t>
+            </w:r>
+            <w:r>
+              <w:t>编号</w:t>
+            </w:r>
+          </w:p>
+          <w:p>
+            <w:pPr>
+              <w:spacing w:line="440" w:lineRule="exact"/>
+            </w:pPr>
+            <w:r>
+              <w:t xml:space="preserve">uint64 rss_kb = 2; // </w:t>
+            </w:r>
+            <w:r>
+              <w:t>编号不能重复，从</w:t>
+            </w:r>
+            <w:r>
+              <w:t>1</w:t>
+            </w:r>
+            <w:r>
+              <w:t>开始</w:t>
+            </w:r>
+          </w:p>
+          <w:p>
+            <w:pPr>
+              <w:spacing w:line="440" w:lineRule="exact"/>
+            </w:pPr>
+            <w:r>
+              <w:t>}</w:t>
+            </w:r>
+          </w:p>
+          <w:p>
+            <w:pPr>
+              <w:spacing w:line="440" w:lineRule="exact"/>
+            </w:pPr>
+            <w:r>
+              <w:t xml:space="preserve">service HealthCheck { // </w:t>
+            </w:r>
+            <w:r>
+              <w:t>定义服务（类似接口）</w:t>
+            </w:r>
+          </w:p>
+          <w:p>
+            <w:pPr>
+              <w:spacing w:line="440" w:lineRule="exact"/>
+            </w:pPr>
+            <w:r>
+              <w:t>rpc Do(HealthCheckRequest) returns (HealthCheckResponse);</w:t>
+            </w:r>
+          </w:p>
+          <w:p>
+            <w:pPr>
+              <w:spacing w:line="440" w:lineRule="exact"/>
+            </w:pPr>
+            <w:r>
+              <w:t>}</w:t>
+            </w:r>
+          </w:p>
+          <w:p>
+            <w:pPr>
+              <w:spacing w:line="440" w:lineRule="exact"/>
+            </w:pPr>
+            <w:r>
+              <w:t>推荐资源：</w:t>
+            </w:r>
+            <w:hyperlink r:id="rId8" w:tgtFrame="_blank" w:history="1">
+              <w:r>
+                <w:rPr>
+                  <w:rStyle w:val="a4"/>
+                </w:rPr>
+                <w:t xml:space="preserve">proto3 </w:t>
+              </w:r>
+              <w:r>
+                <w:rPr>
+                  <w:rStyle w:val="a4"/>
+                </w:rPr>
+                <w:t>语言指南</w:t>
+              </w:r>
+            </w:hyperlink>
+            <w:r>
+              <w:t>，只需看</w:t>
+            </w:r>
+            <w:r>
+              <w:t xml:space="preserve"> Message / Field / Service / Import </w:t>
+            </w:r>
+            <w:r>
+              <w:t>这四节，</w:t>
+            </w:r>
+            <w:r>
+              <w:t>30</w:t>
+            </w:r>
+            <w:r>
+              <w:t>分钟够用。</w:t>
+            </w:r>
+          </w:p>
+          <w:p>
+            <w:pPr>
+              <w:spacing w:line="440" w:lineRule="exact"/>
+            </w:pPr>
+          </w:p>
+          <w:p>
+            <w:pPr>
+              <w:spacing w:line="440" w:lineRule="exact"/>
+            </w:pPr>
+            <w:r>
+              <w:rPr>
+                <w:rFonts w:hint="eastAsia"/>
+              </w:rPr>
+              <w:t>Q:</w:t>
+            </w:r>
+            <w:r>
+              <w:rPr>
+                <w:rFonts w:ascii="宋体" w:hAnsi="宋体" w:cs="宋体"/>
+                <w:kern w:val="0"/>
+              </w:rPr>
+              <w:t xml:space="preserve"> </w:t>
+            </w:r>
+            <w:r>
+              <w:rPr>
+                <w:rFonts w:ascii="宋体" w:hAnsi="宋体" w:cs="宋体" w:hint="eastAsia"/>
+                <w:kern w:val="0"/>
+              </w:rPr>
+              <w:t>引用 -&gt;</w:t>
+            </w:r>
+            <w:r>
+              <w:t xml:space="preserve">Proto </w:t>
+            </w:r>
+            <w:r>
+              <w:t>文件是整个项目的接口合同</w:t>
+            </w:r>
+            <w:r>
+              <w:t>——</w:t>
+            </w:r>
+            <w:r>
+              <w:t>用一种语言无关的格式定义</w:t>
+            </w:r>
+            <w:r>
+              <w:t>"</w:t>
+            </w:r>
+            <w:r>
+              <w:t>组件之间传什么数据、调什么函数</w:t>
+            </w:r>
+            <w:r>
+              <w:t>"</w:t>
+            </w:r>
+            <w:r>
+              <w:t>。写好之后用</w:t>
+            </w:r>
+            <w:r>
+              <w:t xml:space="preserve"> protoc </w:t>
+            </w:r>
+            <w:r>
+              <w:t>编译器自动生成</w:t>
+            </w:r>
+            <w:r>
+              <w:t xml:space="preserve"> C++ </w:t>
+            </w:r>
+            <w:r>
+              <w:t>和</w:t>
+            </w:r>
+            <w:r>
+              <w:t xml:space="preserve"> Go </w:t>
+            </w:r>
+            <w:r>
+              <w:t>的代码，所有组件都基于这份生成代码通信</w:t>
+            </w:r>
+          </w:p>
+          <w:p>
+            <w:pPr>
+              <w:spacing w:line="440" w:lineRule="exact"/>
+            </w:pPr>
+            <w:r>
+              <w:t>我的理解是：</w:t>
+            </w:r>
+            <w:r>
+              <w:t>proto</w:t>
+            </w:r>
+            <w:r>
+              <w:t>文件就是用来定义传输的数据类型，并定义谁传输谁接受数据？</w:t>
+            </w:r>
+          </w:p>
+          <w:p>
+            <w:pPr>
+              <w:spacing w:line="440" w:lineRule="exact"/>
+            </w:pPr>
+            <w:r>
+              <w:rPr>
+                <w:rFonts w:hint="eastAsia"/>
+              </w:rPr>
+              <w:t>A</w:t>
+            </w:r>
+            <w:r>
+              <w:rPr>
+                <w:rFonts w:hint="eastAsia"/>
+              </w:rPr>
+              <w:t>（核心回答）</w:t>
+            </w:r>
+            <w:r>
+              <w:rPr>
+                <w:rFonts w:hint="eastAsia"/>
+              </w:rPr>
+              <w:t>:</w:t>
+            </w:r>
+          </w:p>
+          <w:p>
+            <w:pPr>
+              <w:spacing w:line="440" w:lineRule="exact"/>
+            </w:pPr>
+            <w:r>
+              <w:t xml:space="preserve">Proto </w:t>
+            </w:r>
+            <w:r>
+              <w:t>文件定义了：数据结构（传什么）</w:t>
+            </w:r>
+            <w:r>
+              <w:t xml:space="preserve">+ </w:t>
+            </w:r>
+            <w:r>
+              <w:t>服务接口（能调哪些函数）。</w:t>
+            </w:r>
+            <w:r>
+              <w:br/>
+              <w:t xml:space="preserve">protoc </w:t>
+            </w:r>
+            <w:r>
+              <w:t>编译器根据这份定义，自动生成</w:t>
+            </w:r>
+            <w:r>
+              <w:t xml:space="preserve"> C++ </w:t>
+            </w:r>
+            <w:r>
+              <w:t>和</w:t>
+            </w:r>
+            <w:r>
+              <w:t xml:space="preserve"> Go </w:t>
+            </w:r>
+            <w:r>
+              <w:t>的代码骨架，你只需要填入具体的业务逻辑。</w:t>
+            </w:r>
+          </w:p>
+          <w:p>
+            <w:pPr>
+              <w:spacing w:line="440" w:lineRule="exact"/>
+              <w:rPr>
+                <w:rFonts w:hint="eastAsia"/>
+              </w:rPr>
+            </w:pPr>
+            <w:r>
+              <w:t>类比：</w:t>
+            </w:r>
+            <w:r>
+              <w:t xml:space="preserve">proto </w:t>
+            </w:r>
+            <w:r>
+              <w:t>文件就像餐厅的菜单，定义了有哪些菜（函数）和每道菜的食材（数据结构）。厨房（服务端）负责做菜，顾</w:t>
+            </w:r>
+            <w:r>
+              <w:lastRenderedPageBreak/>
+              <w:t>客（客户端）负责点菜，菜单本身不规定谁是厨房谁是顾客。</w:t>
+            </w:r>
           </w:p>
         </w:tc>
       </w:tr>
@@ -1963,6 +2514,39 @@
             <w:pPr>
               <w:spacing w:line="440" w:lineRule="exact"/>
             </w:pPr>
+            <w:r>
+              <w:t>项目中</w:t>
+            </w:r>
+            <w:r>
+              <w:rPr>
+                <w:rFonts w:hint="eastAsia"/>
+              </w:rPr>
+              <w:t>的</w:t>
+            </w:r>
+            <w:r>
+              <w:t>agent</w:t>
+            </w:r>
+            <w:r>
+              <w:t>是额外连接现有的</w:t>
+            </w:r>
+            <w:r>
+              <w:t>agent</w:t>
+            </w:r>
+            <w:r>
+              <w:t>还是</w:t>
+            </w:r>
+            <w:r>
+              <w:rPr>
+                <w:rFonts w:hint="eastAsia"/>
+              </w:rPr>
+              <w:t>自行训练</w:t>
+            </w:r>
+            <w:r>
+              <w:t>agent</w:t>
+            </w:r>
+            <w:r>
+              <w:t>？</w:t>
+            </w:r>
           </w:p>
         </w:tc>
       </w:tr>
@@ -2006,14 +2590,7 @@
               <w:rPr>
                 <w:rFonts w:hint="eastAsia"/>
               </w:rPr>
-              <w:t>自己对问题的理</w:t>
-            </w:r>
-            <w:r>
-              <w:rPr>
-                <w:rFonts w:hint="eastAsia"/>
-              </w:rPr>
-              <w:lastRenderedPageBreak/>
-              <w:t>解或预判</w:t>
+              <w:t>自己对问题的理解或预判</w:t>
             </w:r>
           </w:p>
         </w:tc>
@@ -2027,6 +2604,36 @@
             <w:pPr>
               <w:spacing w:line="440" w:lineRule="exact"/>
             </w:pPr>
+            <w:r>
+              <w:rPr>
+                <w:rFonts w:hint="eastAsia"/>
+              </w:rPr>
+              <w:t>个人对</w:t>
+            </w:r>
+            <w:r>
+              <w:rPr>
+                <w:rFonts w:hint="eastAsia"/>
+              </w:rPr>
+              <w:t>agent</w:t>
+            </w:r>
+            <w:r>
+              <w:rPr>
+                <w:rFonts w:hint="eastAsia"/>
+              </w:rPr>
+              <w:t>的理解还停留在市面上的</w:t>
+            </w:r>
+            <w:r>
+              <w:rPr>
+                <w:rFonts w:hint="eastAsia"/>
+              </w:rPr>
+              <w:t>ai agent</w:t>
+            </w:r>
+            <w:r>
+              <w:rPr>
+                <w:rFonts w:hint="eastAsia"/>
+              </w:rPr>
+              <w:t>。</w:t>
+            </w:r>
           </w:p>
         </w:tc>
       </w:tr>
@@ -2934,6 +3541,30 @@
       <w:jc w:val="both"/>
     </w:pPr>
   </w:style>
+  <w:style w:type="paragraph" w:styleId="2">
+    <w:name w:val="heading 2"/>
+    <w:basedOn w:val="a"/>
+    <w:next w:val="a"/>
+    <w:link w:val="20"/>
+    <w:uiPriority w:val="9"/>
+    <w:semiHidden/>
+    <w:unhideWhenUsed/>
+    <w:qFormat/>
+    <w:rsid w:val="00F77449"/>
+    <w:pPr>
+      <w:keepNext/>
+      <w:keepLines/>
+      <w:spacing w:before="260" w:after="260" w:line="416" w:lineRule="auto"/>
+      <w:outlineLvl w:val="1"/>
+    </w:pPr>
+    <w:rPr>
+      <w:rFonts w:asciiTheme="majorHAnsi" w:eastAsiaTheme="majorEastAsia" w:hAnsiTheme="majorHAnsi" w:cstheme="majorBidi"/>
+      <w:b/>
+      <w:bCs/>
+      <w:sz w:val="32"/>
+      <w:szCs w:val="32"/>
+    </w:rPr>
+  </w:style>
   <w:style w:type="character" w:default="1" w:styleId="a0">
     <w:name w:val="Default Paragraph Font"/>
     <w:uiPriority w:val="1"/>
@@ -3025,6 +3656,29 @@
       <w:rFonts w:ascii="等线" w:eastAsia="等线" w:hAnsi="等线"/>
       <w:kern w:val="0"/>
     </w:rPr>
+  </w:style>
+  <w:style w:type="character" w:customStyle="1" w:styleId="20">
+    <w:name w:val="标题 2 字符"/>
+    <w:basedOn w:val="a0"/>
+    <w:link w:val="2"/>
+    <w:uiPriority w:val="9"/>
+    <w:semiHidden/>
+    <w:rsid w:val="00F77449"/>
+    <w:rPr>
+      <w:rFonts w:asciiTheme="majorHAnsi" w:eastAsiaTheme="majorEastAsia" w:hAnsiTheme="majorHAnsi" w:cstheme="majorBidi"/>
+      <w:b/>
+      <w:bCs/>
+      <w:sz w:val="32"/>
+      <w:szCs w:val="32"/>
+    </w:rPr>
+  </w:style>
+  <w:style w:type="paragraph" w:styleId="a7">
+    <w:name w:val="Normal (Web)"/>
+    <w:basedOn w:val="a"/>
+    <w:uiPriority w:val="99"/>
+    <w:semiHidden/>
+    <w:unhideWhenUsed/>
+    <w:rsid w:val="00F77449"/>
   </w:style>
 </w:styles>
 </file>

</xml_diff>